<commit_message>
Enablement version 3: Word copies rebuilt after the review fixes; pictures recaptured
Lane W2: Selling It and How It Works rebuilt from 6aa479f5 with the committed converter; What It Is and the
Battlecard unchanged by hash; 21 pictures recaptured, 24 byte-identical; all four documents pass the lane's
eighteen checks.

Co-Authored-By: Claude Fable 5.1 <noreply@anthropic.com>
</commit_message>
<xml_diff>
--- a/docs/enablement/word/Enablement-How-It-Works-and-Where-It-Runs-v3.0.docx
+++ b/docs/enablement/word/Enablement-How-It-Works-and-Where-It-Runs-v3.0.docx
@@ -498,7 +498,7 @@
               <w:rPr>
                 <w:rStyle w:val="IndexLink"/>
               </w:rPr>
-              <w:t xml:space="default">Why customers choose it</w:t>
+              <w:t xml:space="default">Customers choose it for different reasons</w:t>
               <w:tab/>
               <w:t xml:space="default"/>
             </w:r>
@@ -1846,7 +1846,7 @@
           <w:sz w:val="25"/>
           <w:szCs w:val="25"/>
         </w:rPr>
-        <w:t xml:space="preserve">Why customers choose it</w:t>
+        <w:t xml:space="preserve">Customers choose it for different reasons</w:t>
       </w:r>
       <w:bookmarkEnd w:id="6"/>
     </w:p>
@@ -3189,7 +3189,7 @@
       <w:r>
         <w:drawing>
           <wp:inline distT="0" distB="0" distL="0" distR="0">
-            <wp:extent cx="5943600" cy="2728420"/>
+            <wp:extent cx="5943600" cy="3067871"/>
             <wp:effectExtent t="0" r="0" b="0" l="0"/>
             <wp:docPr id="13" name="Figure 13" descr="The region's share of the blend fades as the visitor's own interests grow."/>
             <wp:cNvGraphicFramePr>
@@ -3214,7 +3214,7 @@
                   <pic:spPr bwMode="auto">
                     <a:xfrm>
                       <a:off x="0" y="0"/>
-                      <a:ext cx="5943600" cy="2728420"/>
+                      <a:ext cx="5943600" cy="3067871"/>
                     </a:xfrm>
                     <a:prstGeom prst="rect">
                       <a:avLst/>
@@ -3269,7 +3269,7 @@
           <w:sz w:val="19"/>
           <w:szCs w:val="19"/>
         </w:rPr>
-        <w:t xml:space="preserve">λ = k / (k + Σa)</w:t>
+        <w:t xml:space="preserve">λ = k / (k + Σa), with k the blend constant</w:t>
       </w:r>
     </w:p>
     <w:p>
@@ -3297,7 +3297,21 @@
           <w:sz w:val="21"/>
           <w:szCs w:val="21"/>
         </w:rPr>
-        <w:t xml:space="preserve">A stranger has Σa = 0, so λ = 1 and each ã is the region's share: coats 1, boots 0.6, casual 1, tailored 0.8. After the first view, Σa = 1.07 and λ = 1/(1 + 1.07) = 0.48; after three views, Σa = 2.13 and λ = 0.32.</w:t>
+        <w:t xml:space="preserve">The blend constant k is 1 by default. A stranger has Σa = 0, so λ = 1 and each ã is the region's share: coats 1, boots 0.6, casual 1, tailored 0.8. After the first view, Σa = 1.07 and λ = 1/(1 + 1.07) = 0.48; after three views, Σa = 2.13 and λ = 0.32.</w:t>
+      </w:r>
+    </w:p>
+    <w:p>
+      <w:pPr>
+        <w:spacing w:after="120" w:line="276"/>
+      </w:pPr>
+      <w:r>
+        <w:rPr>
+          <w:rFonts w:ascii="Calibri" w:cs="Calibri" w:eastAsia="Calibri" w:hAnsi="Calibri"/>
+          <w:color w:val="1A1A1A"/>
+          <w:sz w:val="21"/>
+          <w:szCs w:val="21"/>
+        </w:rPr>
+        <w:t xml:space="preserve">Of the three tailored coats, two are premium and one is at the core price, so Σa = 0.625 + 0.625 + 0.526 + 0.357 = 2.13.</w:t>
       </w:r>
     </w:p>
     <w:p>
@@ -4070,7 +4084,7 @@
         </w:rPr>
         <w:t xml:space="preserve">The engine calls no AI model to decide. Opal is where people ask and generative AI creates, and that is where credits apply. </w:t>
       </w:r>
-      <w:hyperlink w:history="1" r:id="rIdeawxtdzdghdrv2yugc7n2">
+      <w:hyperlink w:history="1" r:id="rIdmkmrqeths36sw93oeydmr">
         <w:r>
           <w:rPr>
             <w:rFonts w:ascii="Calibri" w:cs="Calibri" w:eastAsia="Calibri" w:hAnsi="Calibri"/>
@@ -4590,7 +4604,7 @@
       <w:r>
         <w:drawing>
           <wp:inline distT="0" distB="0" distL="0" distR="0">
-            <wp:extent cx="5943600" cy="6276647"/>
+            <wp:extent cx="5943600" cy="6270242"/>
             <wp:effectExtent t="0" r="0" b="0" l="0"/>
             <wp:docPr id="20" name="Figure 20" descr="Each row names what the engine needs, what it is used for and who provides it."/>
             <wp:cNvGraphicFramePr>
@@ -4615,7 +4629,7 @@
                   <pic:spPr bwMode="auto">
                     <a:xfrm>
                       <a:off x="0" y="0"/>
-                      <a:ext cx="5943600" cy="6276647"/>
+                      <a:ext cx="5943600" cy="6270242"/>
                     </a:xfrm>
                     <a:prstGeom prst="rect">
                       <a:avLst/>
@@ -5678,7 +5692,7 @@
       <w:r>
         <w:drawing>
           <wp:inline distT="0" distB="0" distL="0" distR="0">
-            <wp:extent cx="5943600" cy="1350414"/>
+            <wp:extent cx="5943600" cy="1341530"/>
             <wp:effectExtent t="0" r="0" b="0" l="0"/>
             <wp:docPr id="21" name="Figure 21" descr="The companion page recomputes the engine's own arithmetic in the browser as each constant moves: interest, decay, the two lines, a slot scored in full, the regional prior, learning and a receipt."/>
             <wp:cNvGraphicFramePr>
@@ -5703,7 +5717,7 @@
                   <pic:spPr bwMode="auto">
                     <a:xfrm>
                       <a:off x="0" y="0"/>
-                      <a:ext cx="5943600" cy="1350414"/>
+                      <a:ext cx="5943600" cy="1341530"/>
                     </a:xfrm>
                     <a:prstGeom prst="rect">
                       <a:avLst/>
@@ -5735,7 +5749,7 @@
       <w:pPr>
         <w:spacing w:after="120" w:line="276"/>
       </w:pPr>
-      <w:hyperlink w:history="1" r:id="rIdvho3qonigqw_kif_9o62m">
+      <w:hyperlink w:history="1" r:id="rIdhfpsuwsemtbwtaxrloalf">
         <w:r>
           <w:rPr>
             <w:rFonts w:ascii="Calibri" w:cs="Calibri" w:eastAsia="Calibri" w:hAnsi="Calibri"/>

</xml_diff>